<commit_message>
Intro com logo da FANS depois da tela do Unity; cursor nao aparece mais ao morrer
</commit_message>
<xml_diff>
--- a/GDD - Rise of Darkness - Atualizado v2 - Entrga Final - Jogos 1.docx
+++ b/GDD - Rise of Darkness - Atualizado v2 - Entrga Final - Jogos 1.docx
@@ -5645,7 +5645,7 @@
           <w:sz w:val="24"/>
           <w:szCs w:val="24"/>
         </w:rPr>
-        <w:t xml:space="preserve">• Abertura com o logo do Unity seguido do logo da FANS, antes do menu principal.</w:t>
+        <w:t>• Abertura: primeiro a tela do Unity, só com a logo do Unity; quando ela termina, a cena Intro mostra a logo da FANS (com fade) e abre o menu principal.</w:t>
       </w:r>
     </w:p>
     <w:p>
@@ -5683,7 +5683,7 @@
           <w:sz w:val="24"/>
           <w:szCs w:val="24"/>
         </w:rPr>
-        <w:t xml:space="preserve">• Build executável para Windows (cenas: MainMenu, Scene 1, Scene 2, VictoryScene e DefeatScene), permitindo iniciar, jogar, pausar e encerrar o jogo pelos menus.</w:t>
+        <w:t>• Build executável para Windows (cenas: Intro, MainMenu, Scene 1, Scene 2, VictoryScene e DefeatScene), permitindo iniciar, jogar, pausar e encerrar o jogo pelos menus.</w:t>
       </w:r>
     </w:p>
     <w:p>

</xml_diff>

<commit_message>
Pegada do sabre na queda/pouso fixa da animacao parada; GDD e README atualizados
</commit_message>
<xml_diff>
--- a/GDD - Rise of Darkness - Atualizado v2 - Entrga Final - Jogos 1.docx
+++ b/GDD - Rise of Darkness - Atualizado v2 - Entrga Final - Jogos 1.docx
@@ -3079,7 +3079,7 @@
           <w:sz w:val="24"/>
           <w:szCs w:val="24"/>
         </w:rPr>
-        <w:t xml:space="preserve"> cada golpe de sabre que acerta um inimigo carrega 10% da aura. Carregada, ela aumenta vida, velocidade e dano (×1,5) e libera a explosão de aura (Espaço).</w:t>
+        <w:t xml:space="preserve"> cada golpe de sabre que acerta um inimigo carrega 10% da aura. Carregada, ela aumenta vida, velocidade e dano (×1,5) e libera a explosão de aura (Espaço). Com a aura carregada, o Espaço interrompe até um golpe de sabre em andamento para lançar a explosão na hora.</w:t>
       </w:r>
     </w:p>
     <w:p>
@@ -3184,7 +3184,7 @@
           <w:sz w:val="24"/>
           <w:szCs w:val="24"/>
         </w:rPr>
-        <w:t xml:space="preserve"> no menu de pausa, de 0,5× a 2×. Altera a velocidade e a cadência de tiro dos inimigos e a resistência do boss.</w:t>
+        <w:t xml:space="preserve"> no menu de pausa, de 0,5× a 2× (padrão 1,0×). Altera a velocidade e a cadência de tiro dos inimigos e a resistência do boss.</w:t>
       </w:r>
     </w:p>
     <w:p>
@@ -4399,7 +4399,7 @@
           <w:sz w:val="24"/>
           <w:szCs w:val="24"/>
         </w:rPr>
-        <w:t xml:space="preserve">Os golpes e o poder usam Animation Events para abrir e fechar a janela de dano, tocar sons e liberar a explosão no momento certo da animação. Personagens e animações humanoides vêm do Mixamo, configurados no projeto (retarget humanoide, IK, eventos e máquinas de estado).</w:t>
+        <w:t>Os golpes e o poder usam Animation Events para abrir e fechar a janela de dano, tocar sons e liberar a explosão no momento certo da animação. Nas animações de queda e pouso (feitas sem arma), os pés voltam à pose natural do modelo e a mão do sabre usa a pegada da animação parada, para não ficarem torcidos nem com a mão aberta. Personagens e animações humanoides vêm do Mixamo, configurados no projeto (retarget humanoide, IK, eventos e máquinas de estado).</w:t>
       </w:r>
     </w:p>
     <w:p>

</xml_diff>

<commit_message>
GDD volta a versao anterior; rotacao do ceu atualizada
</commit_message>
<xml_diff>
--- a/GDD - Rise of Darkness - Atualizado v2 - Entrga Final - Jogos 1.docx
+++ b/GDD - Rise of Darkness - Atualizado v2 - Entrga Final - Jogos 1.docx
@@ -3079,7 +3079,7 @@
           <w:sz w:val="24"/>
           <w:szCs w:val="24"/>
         </w:rPr>
-        <w:t xml:space="preserve"> cada golpe de sabre que acerta um inimigo carrega 10% da aura. Carregada, ela aumenta vida, velocidade e dano (×1,5) e libera a explosão de aura (Espaço). Com a aura carregada, o Espaço interrompe até um golpe de sabre em andamento para lançar a explosão na hora.</w:t>
+        <w:t xml:space="preserve"> cada golpe de sabre que acerta um inimigo carrega 10% da aura. Carregada, ela aumenta vida, velocidade e dano (×1,5) e libera a explosão de aura (Espaço).</w:t>
       </w:r>
     </w:p>
     <w:p>
@@ -3184,7 +3184,7 @@
           <w:sz w:val="24"/>
           <w:szCs w:val="24"/>
         </w:rPr>
-        <w:t xml:space="preserve"> no menu de pausa, de 0,5× a 2× (padrão 1,0×). Altera a velocidade e a cadência de tiro dos inimigos e a resistência do boss.</w:t>
+        <w:t xml:space="preserve"> no menu de pausa, de 0,5× a 2×. Altera a velocidade e a cadência de tiro dos inimigos e a resistência do boss.</w:t>
       </w:r>
     </w:p>
     <w:p>
@@ -4399,7 +4399,7 @@
           <w:sz w:val="24"/>
           <w:szCs w:val="24"/>
         </w:rPr>
-        <w:t>Os golpes e o poder usam Animation Events para abrir e fechar a janela de dano, tocar sons e liberar a explosão no momento certo da animação. Nas animações de queda e pouso (feitas sem arma), os pés voltam à pose natural do modelo e a mão do sabre usa a pegada da animação parada, para não ficarem torcidos nem com a mão aberta. Personagens e animações humanoides vêm do Mixamo, configurados no projeto (retarget humanoide, IK, eventos e máquinas de estado).</w:t>
+        <w:t xml:space="preserve">Os golpes e o poder usam Animation Events para abrir e fechar a janela de dano, tocar sons e liberar a explosão no momento certo da animação. Personagens e animações humanoides vêm do Mixamo, configurados no projeto (retarget humanoide, IK, eventos e máquinas de estado).</w:t>
       </w:r>
     </w:p>
     <w:p>

</xml_diff>